<commit_message>
docs: actualizar documentacion con cambios de validaciones y notificaciones
</commit_message>
<xml_diff>
--- a/docs/documentacion_completa.docx
+++ b/docs/documentacion_completa.docx
@@ -6443,6 +6443,576 @@
         </w:tc>
       </w:tr>
     </w:tbl>
+    <w:p/>
+    <w:p>
+      <w:pPr>
+        <w:pStyle w:val="Heading1"/>
+      </w:pPr>
+      <w:r>
+        <w:t>16. Actualizaciones y Mejoras Implementadas (Mayo 2026)</w:t>
+      </w:r>
+    </w:p>
+    <w:p>
+      <w:r>
+        <w:t>Esta seccion documenta las mejoras implementadas al sistema en mayo de 2026, incluyendo validaciones de formulario y el nuevo subsistema de notificaciones.</w:t>
+      </w:r>
+    </w:p>
+    <w:p>
+      <w:pPr>
+        <w:pStyle w:val="Heading2"/>
+      </w:pPr>
+      <w:r>
+        <w:t>16.1 Validacion de Formato de Correo Electronico</w:t>
+      </w:r>
+    </w:p>
+    <w:p>
+      <w:r>
+        <w:rPr>
+          <w:b/>
+        </w:rPr>
+        <w:t>Problema resuelto:</w:t>
+      </w:r>
+      <w:r>
+        <w:t xml:space="preserve"> El formulario de registro aceptaba correos invalidos como "juansin@" o "juan.com" sin el simbolo @ o sin dominio valido.</w:t>
+      </w:r>
+    </w:p>
+    <w:p>
+      <w:r>
+        <w:rPr>
+          <w:b/>
+        </w:rPr>
+        <w:t>Archivos modificados:</w:t>
+      </w:r>
+    </w:p>
+    <w:p>
+      <w:pPr>
+        <w:numPr>
+          <w:ilvl w:val="0"/>
+          <w:numId w:val="1"/>
+        </w:numPr>
+      </w:pPr>
+      <w:r>
+        <w:t>frontend/pages/registro.html</w:t>
+      </w:r>
+    </w:p>
+    <w:p>
+      <w:pPr>
+        <w:numPr>
+          <w:ilvl w:val="0"/>
+          <w:numId w:val="1"/>
+        </w:numPr>
+      </w:pPr>
+      <w:r>
+        <w:t>backend/schemas.py</w:t>
+      </w:r>
+    </w:p>
+    <w:p>
+      <w:r>
+        <w:rPr>
+          <w:b/>
+        </w:rPr>
+        <w:t>Implementacion en el frontend (registro.html):</w:t>
+      </w:r>
+    </w:p>
+    <w:p>
+      <w:r>
+        <w:t>Se agrego la funcion validarEmail() con la expresion regular /^[^\s@]+@[^\s@]+\.[a-zA-Z]{2,}$/ que verifica que el correo tenga algo antes del @, un dominio valido y una extension de al menos 2 letras. La validacion ocurre en tres momentos:</w:t>
+      </w:r>
+    </w:p>
+    <w:p>
+      <w:pPr>
+        <w:numPr>
+          <w:ilvl w:val="0"/>
+          <w:numId w:val="1"/>
+        </w:numPr>
+      </w:pPr>
+      <w:r>
+        <w:t>Al salir del campo (evento blur): el borde se pone rojo y aparece mensaje de error.</w:t>
+      </w:r>
+    </w:p>
+    <w:p>
+      <w:pPr>
+        <w:numPr>
+          <w:ilvl w:val="0"/>
+          <w:numId w:val="1"/>
+        </w:numPr>
+      </w:pPr>
+      <w:r>
+        <w:t>Al corregir el valor (evento input): el error desaparece automaticamente.</w:t>
+      </w:r>
+    </w:p>
+    <w:p>
+      <w:pPr>
+        <w:numPr>
+          <w:ilvl w:val="0"/>
+          <w:numId w:val="1"/>
+        </w:numPr>
+      </w:pPr>
+      <w:r>
+        <w:t>Al enviar el formulario: valida nuevamente antes de hacer la peticion al servidor.</w:t>
+      </w:r>
+    </w:p>
+    <w:p>
+      <w:r>
+        <w:rPr>
+          <w:b/>
+        </w:rPr>
+        <w:t>Implementacion en el backend (schemas.py):</w:t>
+      </w:r>
+    </w:p>
+    <w:p>
+      <w:r>
+        <w:t>Se agrego un @field_validator en las clases RegistroRequest y LoginRequest de Pydantic. Si el correo no cumple el patron, el servidor responde con HTTP 422 y el mensaje: "El correo no es valido. Debe tener el formato: ejemplo@dominio.com".</w:t>
+      </w:r>
+    </w:p>
+    <w:p>
+      <w:pPr>
+        <w:pStyle w:val="Heading2"/>
+      </w:pPr>
+      <w:r>
+        <w:t>16.2 Validacion de Nombre y Apellido (Solo Letras)</w:t>
+      </w:r>
+    </w:p>
+    <w:p>
+      <w:r>
+        <w:rPr>
+          <w:b/>
+        </w:rPr>
+        <w:t>Problema resuelto:</w:t>
+      </w:r>
+      <w:r>
+        <w:t xml:space="preserve"> Los campos nombre y apellido del formulario de registro permitían ingresar numeros y simbolos como "Juan123" o "Van#gas".</w:t>
+      </w:r>
+    </w:p>
+    <w:p>
+      <w:r>
+        <w:rPr>
+          <w:b/>
+        </w:rPr>
+        <w:t>Archivos modificados:</w:t>
+      </w:r>
+    </w:p>
+    <w:p>
+      <w:pPr>
+        <w:numPr>
+          <w:ilvl w:val="0"/>
+          <w:numId w:val="1"/>
+        </w:numPr>
+      </w:pPr>
+      <w:r>
+        <w:t>frontend/pages/registro.html</w:t>
+      </w:r>
+    </w:p>
+    <w:p>
+      <w:pPr>
+        <w:numPr>
+          <w:ilvl w:val="0"/>
+          <w:numId w:val="1"/>
+        </w:numPr>
+      </w:pPr>
+      <w:r>
+        <w:t>backend/schemas.py</w:t>
+      </w:r>
+    </w:p>
+    <w:p>
+      <w:r>
+        <w:rPr>
+          <w:b/>
+        </w:rPr>
+        <w:t>Implementacion en el frontend (registro.html):</w:t>
+      </w:r>
+    </w:p>
+    <w:p>
+      <w:r>
+        <w:t>Se agrego la funcion validarSoloLetras() con la expresion regular /^[a-zA-ZaeiouAEIOUuUnN\s]+$/ que permite letras (incluyendo tildes y la enie), espacios, pero rechaza numeros y simbolos. Se aplica a ambos campos mediante la funcion reutilizable aplicarValidacionTexto(). El comportamiento es identico al del correo: error en blur, se limpia al corregir, y se valida al enviar.</w:t>
+      </w:r>
+    </w:p>
+    <w:p>
+      <w:r>
+        <w:rPr>
+          <w:b/>
+        </w:rPr>
+        <w:t>Implementacion en el backend (schemas.py):</w:t>
+      </w:r>
+    </w:p>
+    <w:p>
+      <w:r>
+        <w:t>Se agrego un @field_validator para los campos nombre y apellido en RegistroRequest. Rechaza valores con numeros o simbolos y responde con HTTP 422 y mensaje descriptivo.</w:t>
+      </w:r>
+    </w:p>
+    <w:p>
+      <w:pPr>
+        <w:pStyle w:val="Heading2"/>
+      </w:pPr>
+      <w:r>
+        <w:t>16.3 Subsistema de Notificaciones</w:t>
+      </w:r>
+    </w:p>
+    <w:p>
+      <w:r>
+        <w:rPr>
+          <w:b/>
+        </w:rPr>
+        <w:t>Funcionalidad nueva:</w:t>
+      </w:r>
+      <w:r>
+        <w:t xml:space="preserve"> Se implemento un sistema de notificaciones en tiempo real dentro de la aplicacion que informa a estudiantes y administradores sobre eventos relevantes.</w:t>
+      </w:r>
+    </w:p>
+    <w:p>
+      <w:r>
+        <w:rPr>
+          <w:b/>
+        </w:rPr>
+        <w:t>Archivos modificados:</w:t>
+      </w:r>
+    </w:p>
+    <w:p>
+      <w:pPr>
+        <w:numPr>
+          <w:ilvl w:val="0"/>
+          <w:numId w:val="1"/>
+        </w:numPr>
+      </w:pPr>
+      <w:r>
+        <w:t>frontend/js/main.js (logica central del sistema)</w:t>
+      </w:r>
+    </w:p>
+    <w:p>
+      <w:pPr>
+        <w:numPr>
+          <w:ilvl w:val="0"/>
+          <w:numId w:val="1"/>
+        </w:numPr>
+      </w:pPr>
+      <w:r>
+        <w:t>frontend/pages/postulacion.html (dispara notificaciones al enviar)</w:t>
+      </w:r>
+    </w:p>
+    <w:p>
+      <w:pPr>
+        <w:numPr>
+          <w:ilvl w:val="0"/>
+          <w:numId w:val="1"/>
+        </w:numPr>
+      </w:pPr>
+      <w:r>
+        <w:t>frontend/pages/admin/panel.html (dispara notificaciones al gestionar)</w:t>
+      </w:r>
+    </w:p>
+    <w:p>
+      <w:pPr>
+        <w:numPr>
+          <w:ilvl w:val="0"/>
+          <w:numId w:val="1"/>
+        </w:numPr>
+      </w:pPr>
+      <w:r>
+        <w:t>backend/schemas.py (campo estudianteEmail agregado a PostulacionResponse)</w:t>
+      </w:r>
+    </w:p>
+    <w:p>
+      <w:pPr>
+        <w:numPr>
+          <w:ilvl w:val="0"/>
+          <w:numId w:val="1"/>
+        </w:numPr>
+      </w:pPr>
+      <w:r>
+        <w:t>backend/routers/postulaciones.py (to_response incluye el email del estudiante)</w:t>
+      </w:r>
+    </w:p>
+    <w:p>
+      <w:r>
+        <w:rPr>
+          <w:b/>
+        </w:rPr>
+        <w:t>Arquitectura del sistema:</w:t>
+      </w:r>
+    </w:p>
+    <w:p>
+      <w:r>
+        <w:t>Las notificaciones se almacenan en localStorage del navegador bajo la clave notificaciones_{email}, lo que permite que cada usuario vea solo sus propias notificaciones. El sistema soporta hasta 30 notificaciones por usuario (las mas antiguas se eliminan automaticamente).</w:t>
+      </w:r>
+    </w:p>
+    <w:p>
+      <w:r>
+        <w:rPr>
+          <w:b/>
+        </w:rPr>
+        <w:t>Funciones principales en main.js:</w:t>
+      </w:r>
+    </w:p>
+    <w:p>
+      <w:pPr>
+        <w:numPr>
+          <w:ilvl w:val="0"/>
+          <w:numId w:val="1"/>
+        </w:numPr>
+      </w:pPr>
+      <w:r>
+        <w:t>guardarNotificacion(tipo, mensaje, destinatarioEmail): guarda una notificacion para el usuario destino.</w:t>
+      </w:r>
+    </w:p>
+    <w:p>
+      <w:pPr>
+        <w:numPr>
+          <w:ilvl w:val="0"/>
+          <w:numId w:val="1"/>
+        </w:numPr>
+      </w:pPr>
+      <w:r>
+        <w:t>obtenerNotificaciones(): retorna la lista de notificaciones del usuario actual.</w:t>
+      </w:r>
+    </w:p>
+    <w:p>
+      <w:pPr>
+        <w:numPr>
+          <w:ilvl w:val="0"/>
+          <w:numId w:val="1"/>
+        </w:numPr>
+      </w:pPr>
+      <w:r>
+        <w:t>actualizarContadorNotif(): actualiza el badge rojo con la cantidad de no leidas.</w:t>
+      </w:r>
+    </w:p>
+    <w:p>
+      <w:pPr>
+        <w:numPr>
+          <w:ilvl w:val="0"/>
+          <w:numId w:val="1"/>
+        </w:numPr>
+      </w:pPr>
+      <w:r>
+        <w:t>iniciarNotificaciones(): crea la campana en la barra de navegacion al cargar la pagina.</w:t>
+      </w:r>
+    </w:p>
+    <w:p>
+      <w:r>
+        <w:rPr>
+          <w:b/>
+        </w:rPr>
+        <w:t>Eventos que generan notificaciones:</w:t>
+      </w:r>
+    </w:p>
+    <w:tbl>
+      <w:tblPr>
+        <w:tblW w:type="dxa" w:w="9360"/>
+        <w:tblBorders>
+          <w:top w:val="single" w:sz="4" w:color="CCCCCC"/>
+          <w:left w:val="single" w:sz="4" w:color="CCCCCC"/>
+          <w:bottom w:val="single" w:sz="4" w:color="CCCCCC"/>
+          <w:right w:val="single" w:sz="4" w:color="CCCCCC"/>
+          <w:insideH w:val="single" w:sz="4" w:color="CCCCCC"/>
+          <w:insideV w:val="single" w:sz="4" w:color="CCCCCC"/>
+        </w:tblBorders>
+      </w:tblPr>
+      <w:tblGrid>
+        <w:gridCol w:w="3120"/>
+        <w:gridCol w:w="3120"/>
+        <w:gridCol w:w="3120"/>
+      </w:tblGrid>
+      <w:tr>
+        <w:tc>
+          <w:tcPr>
+            <w:tcW w:type="dxa" w:w="3120"/>
+            <w:shd w:val="clear" w:color="auto" w:fill="1A3A6B"/>
+          </w:tcPr>
+          <w:p>
+            <w:r>
+              <w:rPr>
+                <w:b/>
+                <w:color w:val="FFFFFF"/>
+              </w:rPr>
+              <w:t>Evento</w:t>
+            </w:r>
+          </w:p>
+        </w:tc>
+        <w:tc>
+          <w:tcPr>
+            <w:tcW w:type="dxa" w:w="3120"/>
+            <w:shd w:val="clear" w:color="auto" w:fill="1A3A6B"/>
+          </w:tcPr>
+          <w:p>
+            <w:r>
+              <w:rPr>
+                <w:b/>
+                <w:color w:val="FFFFFF"/>
+              </w:rPr>
+              <w:t>Quien recibe</w:t>
+            </w:r>
+          </w:p>
+        </w:tc>
+        <w:tc>
+          <w:tcPr>
+            <w:tcW w:type="dxa" w:w="3120"/>
+            <w:shd w:val="clear" w:color="auto" w:fill="1A3A6B"/>
+          </w:tcPr>
+          <w:p>
+            <w:r>
+              <w:rPr>
+                <w:b/>
+                <w:color w:val="FFFFFF"/>
+              </w:rPr>
+              <w:t>Tipo</w:t>
+            </w:r>
+          </w:p>
+        </w:tc>
+      </w:tr>
+      <w:tr>
+        <w:tc>
+          <w:tcPr>
+            <w:tcW w:type="dxa" w:w="3120"/>
+            <w:shd w:val="clear" w:color="auto" w:fill="F8FAFF"/>
+          </w:tcPr>
+          <w:p>
+            <w:r>
+              <w:t>Estudiante envia postulacion</w:t>
+            </w:r>
+          </w:p>
+        </w:tc>
+        <w:tc>
+          <w:tcPr>
+            <w:tcW w:type="dxa" w:w="3120"/>
+            <w:shd w:val="clear" w:color="auto" w:fill="F8FAFF"/>
+          </w:tcPr>
+          <w:p>
+            <w:r>
+              <w:t>Admin + Estudiante</w:t>
+            </w:r>
+          </w:p>
+        </w:tc>
+        <w:tc>
+          <w:tcPr>
+            <w:tcW w:type="dxa" w:w="3120"/>
+            <w:shd w:val="clear" w:color="auto" w:fill="F8FAFF"/>
+          </w:tcPr>
+          <w:p>
+            <w:r>
+              <w:t>postulacion</w:t>
+            </w:r>
+          </w:p>
+        </w:tc>
+      </w:tr>
+      <w:tr>
+        <w:tc>
+          <w:tcPr>
+            <w:tcW w:type="dxa" w:w="3120"/>
+            <w:shd w:val="clear" w:color="auto" w:fill="FFFFFF"/>
+          </w:tcPr>
+          <w:p>
+            <w:r>
+              <w:t>Estudiante sube documentos</w:t>
+            </w:r>
+          </w:p>
+        </w:tc>
+        <w:tc>
+          <w:tcPr>
+            <w:tcW w:type="dxa" w:w="3120"/>
+            <w:shd w:val="clear" w:color="auto" w:fill="FFFFFF"/>
+          </w:tcPr>
+          <w:p>
+            <w:r>
+              <w:t>Admin</w:t>
+            </w:r>
+          </w:p>
+        </w:tc>
+        <w:tc>
+          <w:tcPr>
+            <w:tcW w:type="dxa" w:w="3120"/>
+            <w:shd w:val="clear" w:color="auto" w:fill="FFFFFF"/>
+          </w:tcPr>
+          <w:p>
+            <w:r>
+              <w:t>documento</w:t>
+            </w:r>
+          </w:p>
+        </w:tc>
+      </w:tr>
+      <w:tr>
+        <w:tc>
+          <w:tcPr>
+            <w:tcW w:type="dxa" w:w="3120"/>
+            <w:shd w:val="clear" w:color="auto" w:fill="F8FAFF"/>
+          </w:tcPr>
+          <w:p>
+            <w:r>
+              <w:t>Admin guarda comentario</w:t>
+            </w:r>
+          </w:p>
+        </w:tc>
+        <w:tc>
+          <w:tcPr>
+            <w:tcW w:type="dxa" w:w="3120"/>
+            <w:shd w:val="clear" w:color="auto" w:fill="F8FAFF"/>
+          </w:tcPr>
+          <w:p>
+            <w:r>
+              <w:t>Estudiante</w:t>
+            </w:r>
+          </w:p>
+        </w:tc>
+        <w:tc>
+          <w:tcPr>
+            <w:tcW w:type="dxa" w:w="3120"/>
+            <w:shd w:val="clear" w:color="auto" w:fill="F8FAFF"/>
+          </w:tcPr>
+          <w:p>
+            <w:r>
+              <w:t>comentario</w:t>
+            </w:r>
+          </w:p>
+        </w:tc>
+      </w:tr>
+      <w:tr>
+        <w:tc>
+          <w:tcPr>
+            <w:tcW w:type="dxa" w:w="3120"/>
+            <w:shd w:val="clear" w:color="auto" w:fill="FFFFFF"/>
+          </w:tcPr>
+          <w:p>
+            <w:r>
+              <w:t>Admin aprueba o rechaza postulacion</w:t>
+            </w:r>
+          </w:p>
+        </w:tc>
+        <w:tc>
+          <w:tcPr>
+            <w:tcW w:type="dxa" w:w="3120"/>
+            <w:shd w:val="clear" w:color="auto" w:fill="FFFFFF"/>
+          </w:tcPr>
+          <w:p>
+            <w:r>
+              <w:t>Estudiante</w:t>
+            </w:r>
+          </w:p>
+        </w:tc>
+        <w:tc>
+          <w:tcPr>
+            <w:tcW w:type="dxa" w:w="3120"/>
+            <w:shd w:val="clear" w:color="auto" w:fill="FFFFFF"/>
+          </w:tcPr>
+          <w:p>
+            <w:r>
+              <w:t>estado</w:t>
+            </w:r>
+          </w:p>
+        </w:tc>
+      </w:tr>
+    </w:tbl>
+    <w:p>
+      <w:r>
+        <w:rPr>
+          <w:b/>
+        </w:rPr>
+        <w:t>Interfaz de usuario:</w:t>
+      </w:r>
+    </w:p>
+    <w:p>
+      <w:r>
+        <w:t>Se agrega automaticamente un icono de campana en la barra de navegacion de todas las paginas. Cuando hay notificaciones no leidas, aparece un badge rojo con el contador. Al hacer clic en la campana se despliega un panel con todas las notificaciones ordenadas de la mas reciente a la mas antigua. Al abrirlo, todas se marcan como leidas. El boton Limpiar elimina todas las notificaciones del usuario.</w:t>
+      </w:r>
+    </w:p>
     <w:p/>
     <w:sectPr>
       <w:pgSz w:w="12240" w:h="15840"/>

</xml_diff>